<commit_message>
docs: translate the research-proposal branch to English
The proposal labels, enrollment prompts, and sample image names on this branch were still in Vietnamese.
</commit_message>
<xml_diff>
--- a/docs/RESEARCH_PROPOSAL.docx
+++ b/docs/RESEARCH_PROPOSAL.docx
@@ -8743,7 +8743,7 @@
           <w:color w:val="111111"/>
           <w:sz w:val="22"/>
         </w:rPr>
-        <w:t>Nền tảng Cơ sở Dữ liệu &amp; Hệ thống: https://www.youtube.com/watch?v=V7ZU0RKtSoQ</w:t>
+        <w:t>Database platform and systems: https://www.youtube.com/watch?v=V7ZU0RKtSoQ</w:t>
       </w:r>
     </w:p>
     <w:p>
@@ -8756,7 +8756,7 @@
           <w:color w:val="111111"/>
           <w:sz w:val="22"/>
         </w:rPr>
-        <w:t>Kiến trúc &amp; Kỹ thuật Lập trình: https://www.youtube.com/watch?v=uHpzKcm8qh0</w:t>
+        <w:t>Architecture and programming technique: https://www.youtube.com/watch?v=uHpzKcm8qh0</w:t>
       </w:r>
     </w:p>
     <w:p>
@@ -8769,7 +8769,7 @@
           <w:color w:val="111111"/>
           <w:sz w:val="22"/>
         </w:rPr>
-        <w:t>Xử lý Dữ liệu &amp; Hệ thống Backend: https://www.youtube.com/watch?v=cv7EPNXXTxA</w:t>
+        <w:t>Data processing and the backend system: https://www.youtube.com/watch?v=cv7EPNXXTxA</w:t>
       </w:r>
     </w:p>
     <w:p>
@@ -8795,7 +8795,7 @@
           <w:color w:val="111111"/>
           <w:sz w:val="22"/>
         </w:rPr>
-        <w:t>Triển khai Hệ thống &amp; Tối ưu hóa: https://www.youtube.com/watch?v=4FWrmuKQq1s</w:t>
+        <w:t>System deployment and optimization: https://www.youtube.com/watch?v=4FWrmuKQq1s</w:t>
       </w:r>
     </w:p>
     <w:p>

</xml_diff>